<commit_message>
1.2.3 Exclusions & relationships: design agreed (D1-D8 as proposed)
Co-Authored-By: Claude Opus 5.5 <noreply@anthropic.com>
</commit_message>
<xml_diff>
--- a/EXCLUSIONS_RELATIONSHIPS_DESIGN.docx
+++ b/EXCLUSIONS_RELATIONSHIPS_DESIGN.docx
@@ -44,13 +44,13 @@
         <w:rPr>
           <w:b/>
         </w:rPr>
-        <w:t>Design — draft for Boaz's review.</w:t>
-      </w:r>
-      <w:r>
-        <w:rPr>
-          <w:b w:val="0"/>
-        </w:rPr>
-        <w:t xml:space="preserve"> Decisions D1–D8 in section 11 await his answers.</w:t>
+        <w:t>Design — agreed 2026-10-06.</w:t>
+      </w:r>
+      <w:r>
+        <w:rPr>
+          <w:b w:val="0"/>
+        </w:rPr>
+        <w:t xml:space="preserve"> Boaz agreed to D1–D8 as proposed (section 11).</w:t>
       </w:r>
     </w:p>
     <w:p>
@@ -5599,7 +5599,7 @@
         <w:rPr>
           <w:b w:val="0"/>
         </w:rPr>
-        <w:t>11. Decisions for Boaz</w:t>
+        <w:t>11. Decisions (all agreed 2026-10-06, as proposed)</w:t>
       </w:r>
     </w:p>
     <w:p>

</xml_diff>

<commit_message>
1.2.3 exclusions & relationships: step 0 - customers/partners list, matchers, migration (1.2.2.1)
Co-Authored-By: Claude Opus 5.5 <noreply@anthropic.com>
</commit_message>
<xml_diff>
--- a/EXCLUSIONS_RELATIONSHIPS_DESIGN.docx
+++ b/EXCLUSIONS_RELATIONSHIPS_DESIGN.docx
@@ -1963,6 +1963,504 @@
           <w:b w:val="0"/>
         </w:rPr>
         <w:t>), not by the sync layer.</w:t>
+      </w:r>
+    </w:p>
+    <w:p>
+      <w:pPr>
+        <w:pStyle w:val="Heading3"/>
+      </w:pPr>
+      <w:r>
+        <w:rPr>
+          <w:b w:val="0"/>
+        </w:rPr>
+        <w:t>2.7 Step 0 as built (1.2.2.1, 2026-10-06)</w:t>
+      </w:r>
+    </w:p>
+    <w:p>
+      <w:pPr>
+        <w:pStyle w:val="ListBullet"/>
+      </w:pPr>
+      <w:r>
+        <w:rPr>
+          <w:b w:val="0"/>
+        </w:rPr>
+        <w:t xml:space="preserve">New pure </w:t>
+      </w:r>
+      <w:r>
+        <w:rPr>
+          <w:rFonts w:ascii="Consolas" w:hAnsi="Consolas"/>
+          <w:b w:val="0"/>
+        </w:rPr>
+        <w:t>relationships.js</w:t>
+      </w:r>
+      <w:r>
+        <w:rPr>
+          <w:b w:val="0"/>
+        </w:rPr>
+        <w:t xml:space="preserve"> (</w:t>
+      </w:r>
+      <w:r>
+        <w:rPr>
+          <w:rFonts w:ascii="Consolas" w:hAnsi="Consolas"/>
+          <w:b w:val="0"/>
+        </w:rPr>
+        <w:t>splitCompanyLists</w:t>
+      </w:r>
+      <w:r>
+        <w:rPr>
+          <w:b w:val="0"/>
+        </w:rPr>
+        <w:t xml:space="preserve">, </w:t>
+      </w:r>
+      <w:r>
+        <w:rPr>
+          <w:rFonts w:ascii="Consolas" w:hAnsi="Consolas"/>
+          <w:b w:val="0"/>
+        </w:rPr>
+        <w:t>raisePriority</w:t>
+      </w:r>
+      <w:r>
+        <w:rPr>
+          <w:b w:val="0"/>
+        </w:rPr>
+        <w:t xml:space="preserve">, </w:t>
+      </w:r>
+      <w:r>
+        <w:rPr>
+          <w:rFonts w:ascii="Consolas" w:hAnsi="Consolas"/>
+          <w:b w:val="0"/>
+        </w:rPr>
+        <w:t>effectivePriority</w:t>
+      </w:r>
+      <w:r>
+        <w:rPr>
+          <w:b w:val="0"/>
+        </w:rPr>
+        <w:t xml:space="preserve">, </w:t>
+      </w:r>
+      <w:r>
+        <w:rPr>
+          <w:rFonts w:ascii="Consolas" w:hAnsi="Consolas"/>
+          <w:b w:val="0"/>
+        </w:rPr>
+        <w:t>relationshipPromptLine</w:t>
+      </w:r>
+      <w:r>
+        <w:rPr>
+          <w:b w:val="0"/>
+        </w:rPr>
+        <w:t>,</w:t>
+      </w:r>
+    </w:p>
+    <w:p>
+      <w:r>
+        <w:rPr>
+          <w:b w:val="0"/>
+        </w:rPr>
+        <w:t xml:space="preserve">  </w:t>
+      </w:r>
+      <w:r>
+        <w:rPr>
+          <w:rFonts w:ascii="Consolas" w:hAnsi="Consolas"/>
+          <w:b w:val="0"/>
+        </w:rPr>
+        <w:t>relationshipTagText</w:t>
+      </w:r>
+      <w:r>
+        <w:rPr>
+          <w:b w:val="0"/>
+        </w:rPr>
+        <w:t xml:space="preserve">); company-identity.js: </w:t>
+      </w:r>
+      <w:r>
+        <w:rPr>
+          <w:rFonts w:ascii="Consolas" w:hAnsi="Consolas"/>
+          <w:b w:val="0"/>
+        </w:rPr>
+        <w:t>buildExclusionMatcher</w:t>
+      </w:r>
+      <w:r>
+        <w:rPr>
+          <w:b w:val="0"/>
+        </w:rPr>
+        <w:t xml:space="preserve"> skips customer / partner and carries a </w:t>
+      </w:r>
+      <w:r>
+        <w:rPr>
+          <w:rFonts w:ascii="Consolas" w:hAnsi="Consolas"/>
+          <w:b w:val="0"/>
+        </w:rPr>
+        <w:t>kept</w:t>
+      </w:r>
+    </w:p>
+    <w:p>
+      <w:r>
+        <w:rPr>
+          <w:b w:val="0"/>
+        </w:rPr>
+        <w:t xml:space="preserve">  relationship matcher, new </w:t>
+      </w:r>
+      <w:r>
+        <w:rPr>
+          <w:rFonts w:ascii="Consolas" w:hAnsi="Consolas"/>
+          <w:b w:val="0"/>
+        </w:rPr>
+        <w:t>buildRelationshipMatcher</w:t>
+      </w:r>
+      <w:r>
+        <w:rPr>
+          <w:b w:val="0"/>
+        </w:rPr>
+        <w:t xml:space="preserve">, </w:t>
+      </w:r>
+      <w:r>
+        <w:rPr>
+          <w:rFonts w:ascii="Consolas" w:hAnsi="Consolas"/>
+          <w:b w:val="0"/>
+        </w:rPr>
+        <w:t>relationshipOf</w:t>
+      </w:r>
+      <w:r>
+        <w:rPr>
+          <w:b w:val="0"/>
+        </w:rPr>
+        <w:t xml:space="preserve">, </w:t>
+      </w:r>
+      <w:r>
+        <w:rPr>
+          <w:rFonts w:ascii="Consolas" w:hAnsi="Consolas"/>
+          <w:b w:val="0"/>
+        </w:rPr>
+        <w:t>matchesRelationship</w:t>
+      </w:r>
+      <w:r>
+        <w:rPr>
+          <w:b w:val="0"/>
+        </w:rPr>
+        <w:t>. 52 new checks</w:t>
+      </w:r>
+    </w:p>
+    <w:p>
+      <w:r>
+        <w:rPr>
+          <w:b w:val="0"/>
+        </w:rPr>
+        <w:t xml:space="preserve">  (676 in all); team-sync harness 125 checks unchanged.</w:t>
+      </w:r>
+    </w:p>
+    <w:p>
+      <w:pPr>
+        <w:pStyle w:val="ListBullet"/>
+      </w:pPr>
+      <w:r>
+        <w:rPr>
+          <w:b w:val="0"/>
+        </w:rPr>
+        <w:t xml:space="preserve">storage.js: </w:t>
+      </w:r>
+      <w:r>
+        <w:rPr>
+          <w:rFonts w:ascii="Consolas" w:hAnsi="Consolas"/>
+          <w:b w:val="0"/>
+        </w:rPr>
+        <w:t>companyRelationships</w:t>
+      </w:r>
+      <w:r>
+        <w:rPr>
+          <w:b w:val="0"/>
+        </w:rPr>
+        <w:t xml:space="preserve"> with </w:t>
+      </w:r>
+      <w:r>
+        <w:rPr>
+          <w:rFonts w:ascii="Consolas" w:hAnsi="Consolas"/>
+          <w:b w:val="0"/>
+        </w:rPr>
+        <w:t>get</w:t>
+      </w:r>
+      <w:r>
+        <w:rPr>
+          <w:b w:val="0"/>
+        </w:rPr>
+        <w:t xml:space="preserve"> / </w:t>
+      </w:r>
+      <w:r>
+        <w:rPr>
+          <w:rFonts w:ascii="Consolas" w:hAnsi="Consolas"/>
+          <w:b w:val="0"/>
+        </w:rPr>
+        <w:t>save</w:t>
+      </w:r>
+      <w:r>
+        <w:rPr>
+          <w:b w:val="0"/>
+        </w:rPr>
+        <w:t xml:space="preserve">, </w:t>
+      </w:r>
+      <w:r>
+        <w:rPr>
+          <w:rFonts w:ascii="Consolas" w:hAnsi="Consolas"/>
+          <w:b w:val="0"/>
+        </w:rPr>
+        <w:t>saveCompanyLists</w:t>
+      </w:r>
+      <w:r>
+        <w:rPr>
+          <w:b w:val="0"/>
+        </w:rPr>
+        <w:t xml:space="preserve">, </w:t>
+      </w:r>
+      <w:r>
+        <w:rPr>
+          <w:rFonts w:ascii="Consolas" w:hAnsi="Consolas"/>
+          <w:b w:val="0"/>
+        </w:rPr>
+        <w:t>getRelationshipMatcher</w:t>
+      </w:r>
+      <w:r>
+        <w:rPr>
+          <w:b w:val="0"/>
+        </w:rPr>
+        <w:t>;</w:t>
+      </w:r>
+    </w:p>
+    <w:p>
+      <w:r>
+        <w:rPr>
+          <w:b w:val="0"/>
+        </w:rPr>
+        <w:t xml:space="preserve">  </w:t>
+      </w:r>
+      <w:r>
+        <w:rPr>
+          <w:rFonts w:ascii="Consolas" w:hAnsi="Consolas"/>
+          <w:b w:val="0"/>
+        </w:rPr>
+        <w:t>getExclusionMatcher</w:t>
+      </w:r>
+      <w:r>
+        <w:rPr>
+          <w:b w:val="0"/>
+        </w:rPr>
+        <w:t xml:space="preserve"> passes the relationship matcher, so </w:t>
+      </w:r>
+      <w:r>
+        <w:rPr>
+          <w:rFonts w:ascii="Consolas" w:hAnsi="Consolas"/>
+          <w:b w:val="0"/>
+        </w:rPr>
+        <w:t>isCompanyRowExcluded</w:t>
+      </w:r>
+      <w:r>
+        <w:rPr>
+          <w:b w:val="0"/>
+        </w:rPr>
+        <w:t xml:space="preserve"> lets a customer / partner</w:t>
+      </w:r>
+    </w:p>
+    <w:p>
+      <w:r>
+        <w:rPr>
+          <w:b w:val="0"/>
+        </w:rPr>
+        <w:t xml:space="preserve">  through the workbook's Excluded flag. </w:t>
+      </w:r>
+      <w:r>
+        <w:rPr>
+          <w:rFonts w:ascii="Consolas" w:hAnsi="Consolas"/>
+          <w:b w:val="0"/>
+        </w:rPr>
+        <w:t>EXCLUSION_CATEGORIES</w:t>
+      </w:r>
+      <w:r>
+        <w:rPr>
+          <w:b w:val="0"/>
+        </w:rPr>
+        <w:t xml:space="preserve"> is now competitor / recruiter / other.</w:t>
+      </w:r>
+    </w:p>
+    <w:p>
+      <w:pPr>
+        <w:pStyle w:val="ListBullet"/>
+      </w:pPr>
+      <w:r>
+        <w:rPr>
+          <w:rFonts w:ascii="Consolas" w:hAnsi="Consolas"/>
+          <w:b w:val="0"/>
+        </w:rPr>
+        <w:t>migrateCompanyRelationshipsIfNeeded</w:t>
+      </w:r>
+      <w:r>
+        <w:rPr>
+          <w:b w:val="0"/>
+        </w:rPr>
+        <w:t xml:space="preserve"> runs on update (then one pipeline kick), at the end of</w:t>
+      </w:r>
+    </w:p>
+    <w:p>
+      <w:r>
+        <w:rPr>
+          <w:b w:val="0"/>
+        </w:rPr>
+        <w:t xml:space="preserve">  </w:t>
+      </w:r>
+      <w:r>
+        <w:rPr>
+          <w:rFonts w:ascii="Consolas" w:hAnsi="Consolas"/>
+          <w:b w:val="0"/>
+        </w:rPr>
+        <w:t>restoreFullBackup</w:t>
+      </w:r>
+      <w:r>
+        <w:rPr>
+          <w:b w:val="0"/>
+        </w:rPr>
+        <w:t xml:space="preserve"> and after the import backfill (which now puts Customer / Partner reasons on the new list,</w:t>
+      </w:r>
+    </w:p>
+    <w:p>
+      <w:r>
+        <w:rPr>
+          <w:b w:val="0"/>
+        </w:rPr>
+        <w:t xml:space="preserve">  by slug, name or website). It writes the lists directly - a moved slug is not "lifted". Activity Log</w:t>
+      </w:r>
+    </w:p>
+    <w:p>
+      <w:r>
+        <w:rPr>
+          <w:b w:val="0"/>
+        </w:rPr>
+        <w:t xml:space="preserve">  </w:t>
+      </w:r>
+      <w:r>
+        <w:rPr>
+          <w:rFonts w:ascii="Consolas" w:hAnsi="Consolas"/>
+          <w:b w:val="0"/>
+        </w:rPr>
+        <w:t>relationships_migrated</w:t>
+      </w:r>
+      <w:r>
+        <w:rPr>
+          <w:b w:val="0"/>
+        </w:rPr>
+        <w:t xml:space="preserve">; one-time pop-up on Target Accounts (key </w:t>
+      </w:r>
+      <w:r>
+        <w:rPr>
+          <w:rFonts w:ascii="Consolas" w:hAnsi="Consolas"/>
+          <w:b w:val="0"/>
+        </w:rPr>
+        <w:t>relationshipsMigrationNotice</w:t>
+      </w:r>
+      <w:r>
+        <w:rPr>
+          <w:b w:val="0"/>
+        </w:rPr>
+        <w:t>, personal).</w:t>
+      </w:r>
+    </w:p>
+    <w:p>
+      <w:pPr>
+        <w:pStyle w:val="ListBullet"/>
+      </w:pPr>
+      <w:r>
+        <w:rPr>
+          <w:b w:val="0"/>
+        </w:rPr>
+        <w:t>Team: list key appended in team-keys.js; backup wizard keys and the Decisions watch lists include it.</w:t>
+      </w:r>
+    </w:p>
+    <w:p>
+      <w:pPr>
+        <w:pStyle w:val="ListBullet"/>
+      </w:pPr>
+      <w:r>
+        <w:rPr>
+          <w:b/>
+        </w:rPr>
+        <w:t>Interim until step 3:</w:t>
+      </w:r>
+      <w:r>
+        <w:rPr>
+          <w:b w:val="0"/>
+        </w:rPr>
+        <w:t xml:space="preserve"> the Setup step keeps its five boxes; the customer and partner boxes read and save the</w:t>
+      </w:r>
+    </w:p>
+    <w:p>
+      <w:r>
+        <w:rPr>
+          <w:b w:val="0"/>
+        </w:rPr>
+        <w:t xml:space="preserve">  new list (</w:t>
+      </w:r>
+      <w:r>
+        <w:rPr>
+          <w:rFonts w:ascii="Consolas" w:hAnsi="Consolas"/>
+          <w:b w:val="0"/>
+        </w:rPr>
+        <w:t>saveCompanyLists</w:t>
+      </w:r>
+      <w:r>
+        <w:rPr>
+          <w:b w:val="0"/>
+        </w:rPr>
+        <w:t xml:space="preserve">). </w:t>
+      </w:r>
+      <w:r>
+        <w:rPr>
+          <w:rFonts w:ascii="Consolas" w:hAnsi="Consolas"/>
+          <w:b w:val="0"/>
+        </w:rPr>
+        <w:t>parseCompanyListEntry</w:t>
+      </w:r>
+      <w:r>
+        <w:rPr>
+          <w:b w:val="0"/>
+        </w:rPr>
+        <w:t xml:space="preserve"> (3.2) moves to step 3, with the table that uses it.</w:t>
+      </w:r>
+    </w:p>
+    <w:p>
+      <w:pPr>
+        <w:pStyle w:val="ListBullet"/>
+      </w:pPr>
+      <w:r>
+        <w:rPr>
+          <w:b/>
+        </w:rPr>
+        <w:t>Dry run on Boaz's backup of 2026-10-06 18:03 (1.2.1.11):</w:t>
+      </w:r>
+      <w:r>
+        <w:rPr>
+          <w:b w:val="0"/>
+        </w:rPr>
+        <w:t xml:space="preserve"> 41 exclusion entries (29 competitors, 11</w:t>
+      </w:r>
+    </w:p>
+    <w:p>
+      <w:r>
+        <w:rPr>
+          <w:b w:val="0"/>
+        </w:rPr>
+        <w:t xml:space="preserve">  recruiters, 1 partner); one moves - IBM (partner, by LinkedIn slug), which is not an account, so no account comes</w:t>
+      </w:r>
+    </w:p>
+    <w:p>
+      <w:r>
+        <w:rPr>
+          <w:b w:val="0"/>
+        </w:rPr>
+        <w:t xml:space="preserve">  back. The workbook's 10 Excluded = Yes rows are all Competitor. No lead is hidden by the customer / partner</w:t>
+      </w:r>
+    </w:p>
+    <w:p>
+      <w:r>
+        <w:rPr>
+          <w:b w:val="0"/>
+        </w:rPr>
+        <w:t xml:space="preserve">  filters. So the live check on this data is small: IBM shows on the new list, nothing else changes.</w:t>
       </w:r>
     </w:p>
     <w:p>

</xml_diff>

<commit_message>
1.2.3 step 0: live check passed (1.2.2.1)
Co-Authored-By: Claude Opus 5.5 <noreply@anthropic.com>
</commit_message>
<xml_diff>
--- a/EXCLUSIONS_RELATIONSHIPS_DESIGN.docx
+++ b/EXCLUSIONS_RELATIONSHIPS_DESIGN.docx
@@ -2461,6 +2461,39 @@
           <w:b w:val="0"/>
         </w:rPr>
         <w:t xml:space="preserve">  filters. So the live check on this data is small: IBM shows on the new list, nothing else changes.</w:t>
+      </w:r>
+    </w:p>
+    <w:p>
+      <w:pPr>
+        <w:pStyle w:val="ListBullet"/>
+      </w:pPr>
+      <w:r>
+        <w:rPr>
+          <w:b/>
+        </w:rPr>
+        <w:t>Live check passed 2026-10-07</w:t>
+      </w:r>
+      <w:r>
+        <w:rPr>
+          <w:b w:val="0"/>
+        </w:rPr>
+        <w:t xml:space="preserve"> (Reload on the live install): pop-up shown once, account count unchanged,</w:t>
+      </w:r>
+    </w:p>
+    <w:p>
+      <w:r>
+        <w:rPr>
+          <w:b w:val="0"/>
+        </w:rPr>
+        <w:t xml:space="preserve">  Activity Log line, IBM kept in the partner box across a Save. To fix in step 1: the pop-up says "it is now an</w:t>
+      </w:r>
+    </w:p>
+    <w:p>
+      <w:r>
+        <w:rPr>
+          <w:b w:val="0"/>
+        </w:rPr>
+        <w:t xml:space="preserve">  account" even when the moved company is not one of the accounts (IBM).</w:t>
       </w:r>
     </w:p>
     <w:p>

</xml_diff>

<commit_message>
1.2.3 exclusions & relationships: step 1 - lead filters retired, customer priority raise, AI told (1.2.2.2)
Co-Authored-By: Claude Opus 5.5 <noreply@anthropic.com>
</commit_message>
<xml_diff>
--- a/EXCLUSIONS_RELATIONSHIPS_DESIGN.docx
+++ b/EXCLUSIONS_RELATIONSHIPS_DESIGN.docx
@@ -2494,6 +2494,367 @@
           <w:b w:val="0"/>
         </w:rPr>
         <w:t xml:space="preserve">  account" even when the moved company is not one of the accounts (IBM).</w:t>
+      </w:r>
+    </w:p>
+    <w:p>
+      <w:pPr>
+        <w:pStyle w:val="Heading3"/>
+      </w:pPr>
+      <w:r>
+        <w:rPr>
+          <w:b w:val="0"/>
+        </w:rPr>
+        <w:t>2.8 Step 1 as built (1.2.2.2, 2026-10-07)</w:t>
+      </w:r>
+    </w:p>
+    <w:p>
+      <w:pPr>
+        <w:pStyle w:val="ListBullet"/>
+      </w:pPr>
+      <w:r>
+        <w:rPr>
+          <w:b w:val="0"/>
+        </w:rPr>
+        <w:t xml:space="preserve">Lead filters: </w:t>
+      </w:r>
+      <w:r>
+        <w:rPr>
+          <w:rFonts w:ascii="Consolas" w:hAnsi="Consolas"/>
+          <w:b w:val="0"/>
+        </w:rPr>
+        <w:t>builtin-customers</w:t>
+      </w:r>
+      <w:r>
+        <w:rPr>
+          <w:b w:val="0"/>
+        </w:rPr>
+        <w:t xml:space="preserve"> / </w:t>
+      </w:r>
+      <w:r>
+        <w:rPr>
+          <w:rFonts w:ascii="Consolas" w:hAnsi="Consolas"/>
+          <w:b w:val="0"/>
+        </w:rPr>
+        <w:t>builtin-partners</w:t>
+      </w:r>
+      <w:r>
+        <w:rPr>
+          <w:b w:val="0"/>
+        </w:rPr>
+        <w:t xml:space="preserve"> removed from the defaults and dropped from a stored list on</w:t>
+      </w:r>
+    </w:p>
+    <w:p>
+      <w:r>
+        <w:rPr>
+          <w:b w:val="0"/>
+        </w:rPr>
+        <w:t xml:space="preserve">  its next read (</w:t>
+      </w:r>
+      <w:r>
+        <w:rPr>
+          <w:rFonts w:ascii="Consolas" w:hAnsi="Consolas"/>
+          <w:b w:val="0"/>
+        </w:rPr>
+        <w:t>RETIRED_NEGATIVE_TOPIC_IDS</w:t>
+      </w:r>
+      <w:r>
+        <w:rPr>
+          <w:b w:val="0"/>
+        </w:rPr>
+        <w:t>); the Scanner's two checkboxes are gone. On update,</w:t>
+      </w:r>
+    </w:p>
+    <w:p>
+      <w:r>
+        <w:rPr>
+          <w:b w:val="0"/>
+        </w:rPr>
+        <w:t xml:space="preserve">  </w:t>
+      </w:r>
+      <w:r>
+        <w:rPr>
+          <w:rFonts w:ascii="Consolas" w:hAnsi="Consolas"/>
+          <w:b w:val="0"/>
+        </w:rPr>
+        <w:t>restoreRelationshipFilteredLeads</w:t>
+      </w:r>
+      <w:r>
+        <w:rPr>
+          <w:b w:val="0"/>
+        </w:rPr>
+        <w:t xml:space="preserve"> re-judges </w:t>
+      </w:r>
+      <w:r>
+        <w:rPr>
+          <w:b/>
+        </w:rPr>
+        <w:t>only</w:t>
+      </w:r>
+      <w:r>
+        <w:rPr>
+          <w:b w:val="0"/>
+        </w:rPr>
+        <w:t xml:space="preserve"> the leads whose Irrelevant reason starts "Existing</w:t>
+      </w:r>
+    </w:p>
+    <w:p>
+      <w:r>
+        <w:rPr>
+          <w:b w:val="0"/>
+        </w:rPr>
+        <w:t xml:space="preserve">  Customers / Partners" against the current filters (other leads never move) and counts them into the pop-up.</w:t>
+      </w:r>
+    </w:p>
+    <w:p>
+      <w:pPr>
+        <w:pStyle w:val="ListBullet"/>
+      </w:pPr>
+      <w:r>
+        <w:rPr>
+          <w:b w:val="0"/>
+        </w:rPr>
+        <w:t xml:space="preserve">Priority: </w:t>
+      </w:r>
+      <w:r>
+        <w:rPr>
+          <w:rFonts w:ascii="Consolas" w:hAnsi="Consolas"/>
+          <w:b w:val="0"/>
+        </w:rPr>
+        <w:t>accountPriorityFor(row, extra, relMatcher)</w:t>
+      </w:r>
+      <w:r>
+        <w:rPr>
+          <w:b w:val="0"/>
+        </w:rPr>
+        <w:t xml:space="preserve"> in storage.js (base, effective, raised, manual,</w:t>
+      </w:r>
+    </w:p>
+    <w:p>
+      <w:r>
+        <w:rPr>
+          <w:b w:val="0"/>
+        </w:rPr>
+        <w:t xml:space="preserve">  relationship) feeds </w:t>
+      </w:r>
+      <w:r>
+        <w:rPr>
+          <w:rFonts w:ascii="Consolas" w:hAnsi="Consolas"/>
+          <w:b w:val="0"/>
+        </w:rPr>
+        <w:t>getAccountViews</w:t>
+      </w:r>
+      <w:r>
+        <w:rPr>
+          <w:b w:val="0"/>
+        </w:rPr>
+        <w:t xml:space="preserve"> (</w:t>
+      </w:r>
+      <w:r>
+        <w:rPr>
+          <w:rFonts w:ascii="Consolas" w:hAnsi="Consolas"/>
+          <w:b w:val="0"/>
+        </w:rPr>
+        <w:t>salesTeamPriority</w:t>
+      </w:r>
+      <w:r>
+        <w:rPr>
+          <w:b w:val="0"/>
+        </w:rPr>
+        <w:t xml:space="preserve"> is the effective value; </w:t>
+      </w:r>
+      <w:r>
+        <w:rPr>
+          <w:rFonts w:ascii="Consolas" w:hAnsi="Consolas"/>
+          <w:b w:val="0"/>
+        </w:rPr>
+        <w:t>basePriority</w:t>
+      </w:r>
+      <w:r>
+        <w:rPr>
+          <w:b w:val="0"/>
+        </w:rPr>
+        <w:t>,</w:t>
+      </w:r>
+    </w:p>
+    <w:p>
+      <w:r>
+        <w:rPr>
+          <w:b w:val="0"/>
+        </w:rPr>
+        <w:t xml:space="preserve">  </w:t>
+      </w:r>
+      <w:r>
+        <w:rPr>
+          <w:rFonts w:ascii="Consolas" w:hAnsi="Consolas"/>
+          <w:b w:val="0"/>
+        </w:rPr>
+        <w:t>priorityRaised</w:t>
+      </w:r>
+      <w:r>
+        <w:rPr>
+          <w:b w:val="0"/>
+        </w:rPr>
+        <w:t xml:space="preserve">, </w:t>
+      </w:r>
+      <w:r>
+        <w:rPr>
+          <w:rFonts w:ascii="Consolas" w:hAnsi="Consolas"/>
+          <w:b w:val="0"/>
+        </w:rPr>
+        <w:t>relationship</w:t>
+      </w:r>
+      <w:r>
+        <w:rPr>
+          <w:b w:val="0"/>
+        </w:rPr>
+        <w:t xml:space="preserve"> added) and lead matching in </w:t>
+      </w:r>
+      <w:r>
+        <w:rPr>
+          <w:rFonts w:ascii="Consolas" w:hAnsi="Consolas"/>
+          <w:b w:val="0"/>
+        </w:rPr>
+        <w:t>partitionLeadsByTargetAccount</w:t>
+      </w:r>
+      <w:r>
+        <w:rPr>
+          <w:b w:val="0"/>
+        </w:rPr>
+        <w:t>. Target Accounts</w:t>
+      </w:r>
+    </w:p>
+    <w:p>
+      <w:r>
+        <w:rPr>
+          <w:b w:val="0"/>
+        </w:rPr>
+        <w:t xml:space="preserve">  uses it for the Priority column, the priority pie, bulk edit, the HubSpot export (scope and exported value, D4) and</w:t>
+      </w:r>
+    </w:p>
+    <w:p>
+      <w:r>
+        <w:rPr>
+          <w:b w:val="0"/>
+        </w:rPr>
+        <w:t xml:space="preserve">  the account page (raised priority + "Raised one level: existing customer" line in the reason). The CSV table export</w:t>
+      </w:r>
+    </w:p>
+    <w:p>
+      <w:r>
+        <w:rPr>
+          <w:b w:val="0"/>
+        </w:rPr>
+        <w:t xml:space="preserve">  follows the column. Backups keep the stored value.</w:t>
+      </w:r>
+    </w:p>
+    <w:p>
+      <w:pPr>
+        <w:pStyle w:val="ListBullet"/>
+      </w:pPr>
+      <w:r>
+        <w:rPr>
+          <w:b w:val="0"/>
+        </w:rPr>
+        <w:t xml:space="preserve">AI: </w:t>
+      </w:r>
+      <w:r>
+        <w:rPr>
+          <w:rFonts w:ascii="Consolas" w:hAnsi="Consolas"/>
+          <w:b w:val="0"/>
+        </w:rPr>
+        <w:t>relationshipPromptLine</w:t>
+      </w:r>
+      <w:r>
+        <w:rPr>
+          <w:b w:val="0"/>
+        </w:rPr>
+        <w:t xml:space="preserve"> in the account overview (account / contact Mentor and Customer Voice), the lead Mentor</w:t>
+      </w:r>
+    </w:p>
+    <w:p>
+      <w:r>
+        <w:rPr>
+          <w:b w:val="0"/>
+        </w:rPr>
+        <w:t xml:space="preserve">  (Leads Dashboard), every outreach draft (</w:t>
+      </w:r>
+      <w:r>
+        <w:rPr>
+          <w:rFonts w:ascii="Consolas" w:hAnsi="Consolas"/>
+          <w:b w:val="0"/>
+        </w:rPr>
+        <w:t>generateDraft</w:t>
+      </w:r>
+      <w:r>
+        <w:rPr>
+          <w:b w:val="0"/>
+        </w:rPr>
+        <w:t xml:space="preserve"> looks the company up itself) and the general Mentor's lead</w:t>
+      </w:r>
+    </w:p>
+    <w:p>
+      <w:r>
+        <w:rPr>
+          <w:b w:val="0"/>
+        </w:rPr>
+        <w:t xml:space="preserve">  list (</w:t>
+      </w:r>
+      <w:r>
+        <w:rPr>
+          <w:rFonts w:ascii="Consolas" w:hAnsi="Consolas"/>
+          <w:b w:val="0"/>
+        </w:rPr>
+        <w:t>relationship</w:t>
+      </w:r>
+      <w:r>
+        <w:rPr>
+          <w:b w:val="0"/>
+        </w:rPr>
+        <w:t xml:space="preserve"> field).</w:t>
+      </w:r>
+    </w:p>
+    <w:p>
+      <w:pPr>
+        <w:pStyle w:val="ListBullet"/>
+      </w:pPr>
+      <w:r>
+        <w:rPr>
+          <w:b w:val="0"/>
+        </w:rPr>
+        <w:t>Pop-up text moved into relationships.js (</w:t>
+      </w:r>
+      <w:r>
+        <w:rPr>
+          <w:rFonts w:ascii="Consolas" w:hAnsi="Consolas"/>
+          <w:b w:val="0"/>
+        </w:rPr>
+        <w:t>relationshipsMovedText</w:t>
+      </w:r>
+      <w:r>
+        <w:rPr>
+          <w:b w:val="0"/>
+        </w:rPr>
+        <w:t>, tested): it now counts the accounts that really</w:t>
+      </w:r>
+    </w:p>
+    <w:p>
+      <w:r>
+        <w:rPr>
+          <w:b w:val="0"/>
+        </w:rPr>
+        <w:t xml:space="preserve">  come back and says "None of them is one of your accounts" otherwise (the IBM case), plus leads restored.</w:t>
+      </w:r>
+    </w:p>
+    <w:p>
+      <w:pPr>
+        <w:pStyle w:val="ListBullet"/>
+      </w:pPr>
+      <w:r>
+        <w:rPr>
+          <w:b w:val="0"/>
+        </w:rPr>
+        <w:t>Help: the Negative Topics entry no longer names the two filters. 681 pure checks, 125 team-sync checks.</w:t>
       </w:r>
     </w:p>
     <w:p>

</xml_diff>

<commit_message>
1.2.3 step 1: live check passed (1.2.2.2)
Co-Authored-By: Claude Opus 5.5 <noreply@anthropic.com>
</commit_message>
<xml_diff>
--- a/EXCLUSIONS_RELATIONSHIPS_DESIGN.docx
+++ b/EXCLUSIONS_RELATIONSHIPS_DESIGN.docx
@@ -2855,6 +2855,31 @@
           <w:b w:val="0"/>
         </w:rPr>
         <w:t>Help: the Negative Topics entry no longer names the two filters. 681 pure checks, 125 team-sync checks.</w:t>
+      </w:r>
+    </w:p>
+    <w:p>
+      <w:pPr>
+        <w:pStyle w:val="ListBullet"/>
+      </w:pPr>
+      <w:r>
+        <w:rPr>
+          <w:b/>
+        </w:rPr>
+        <w:t>Live check passed 2026-10-07:</w:t>
+      </w:r>
+      <w:r>
+        <w:rPr>
+          <w:b w:val="0"/>
+        </w:rPr>
+        <w:t xml:space="preserve"> Scanner checkboxes gone; a P3 account added as customer showed P2 with the</w:t>
+      </w:r>
+    </w:p>
+    <w:p>
+      <w:r>
+        <w:rPr>
+          <w:b w:val="0"/>
+        </w:rPr>
+        <w:t xml:space="preserve">  reason line, the Mentor called it an existing customer, and removing it brought P3 back.</w:t>
       </w:r>
     </w:p>
     <w:p>

</xml_diff>

<commit_message>
1.2.3 exclusions & relationships: step 2 - tags, Relationship column + choice filter, Relationship... dialog (1.2.2.3)
Co-Authored-By: Claude Opus 5.5 <noreply@anthropic.com>
</commit_message>
<xml_diff>
--- a/EXCLUSIONS_RELATIONSHIPS_DESIGN.docx
+++ b/EXCLUSIONS_RELATIONSHIPS_DESIGN.docx
@@ -2880,6 +2880,275 @@
           <w:b w:val="0"/>
         </w:rPr>
         <w:t xml:space="preserve">  reason line, the Mentor called it an existing customer, and removing it brought P3 back.</w:t>
+      </w:r>
+    </w:p>
+    <w:p>
+      <w:pPr>
+        <w:pStyle w:val="Heading3"/>
+      </w:pPr>
+      <w:r>
+        <w:rPr>
+          <w:b w:val="0"/>
+        </w:rPr>
+        <w:t>2.9 Step 2 as built (1.2.2.3, 2026-10-07)</w:t>
+      </w:r>
+    </w:p>
+    <w:p>
+      <w:pPr>
+        <w:pStyle w:val="ListBullet"/>
+      </w:pPr>
+      <w:r>
+        <w:rPr>
+          <w:b w:val="0"/>
+        </w:rPr>
+        <w:t xml:space="preserve">Tag </w:t>
+      </w:r>
+      <w:r>
+        <w:rPr>
+          <w:rFonts w:ascii="Consolas" w:hAnsi="Consolas"/>
+          <w:b w:val="0"/>
+        </w:rPr>
+        <w:t>.relationship-tag</w:t>
+      </w:r>
+      <w:r>
+        <w:rPr>
+          <w:b w:val="0"/>
+        </w:rPr>
+        <w:t xml:space="preserve"> (purple outline pill; same style in dashboard.css): account page between the title and the</w:t>
+      </w:r>
+    </w:p>
+    <w:p>
+      <w:r>
+        <w:rPr>
+          <w:b w:val="0"/>
+        </w:rPr>
+        <w:t xml:space="preserve">  ⋮ (</w:t>
+      </w:r>
+      <w:r>
+        <w:rPr>
+          <w:rFonts w:ascii="Consolas" w:hAnsi="Consolas"/>
+          <w:b w:val="0"/>
+        </w:rPr>
+        <w:t>#account-relationship-tag</w:t>
+      </w:r>
+      <w:r>
+        <w:rPr>
+          <w:b w:val="0"/>
+        </w:rPr>
+        <w:t>), contact page beside the Company field, Target Contacts company cell (after the</w:t>
+      </w:r>
+    </w:p>
+    <w:p>
+      <w:r>
+        <w:rPr>
+          <w:b w:val="0"/>
+        </w:rPr>
+        <w:t xml:space="preserve">  team badge), Leads Dashboard Company column (matcher loaded at init, reloaded when either list key changes).</w:t>
+      </w:r>
+    </w:p>
+    <w:p>
+      <w:pPr>
+        <w:pStyle w:val="ListBullet"/>
+      </w:pPr>
+      <w:r>
+        <w:rPr>
+          <w:b w:val="0"/>
+        </w:rPr>
+        <w:t xml:space="preserve">Target Accounts column </w:t>
+      </w:r>
+      <w:r>
+        <w:rPr>
+          <w:rFonts w:ascii="Consolas" w:hAnsi="Consolas"/>
+          <w:b w:val="0"/>
+        </w:rPr>
+        <w:t>relationship</w:t>
+      </w:r>
+      <w:r>
+        <w:rPr>
+          <w:b w:val="0"/>
+        </w:rPr>
+        <w:t xml:space="preserve"> ("Relationship", shown by default, right after Priority). Column definitions</w:t>
+      </w:r>
+    </w:p>
+    <w:p>
+      <w:r>
+        <w:rPr>
+          <w:b w:val="0"/>
+        </w:rPr>
+        <w:t xml:space="preserve">  can now carry </w:t>
+      </w:r>
+      <w:r>
+        <w:rPr>
+          <w:rFonts w:ascii="Consolas" w:hAnsi="Consolas"/>
+          <w:b w:val="0"/>
+        </w:rPr>
+        <w:t>filterOptions</w:t>
+      </w:r>
+      <w:r>
+        <w:rPr>
+          <w:b w:val="0"/>
+        </w:rPr>
+        <w:t xml:space="preserve"> + </w:t>
+      </w:r>
+      <w:r>
+        <w:rPr>
+          <w:rFonts w:ascii="Consolas" w:hAnsi="Consolas"/>
+          <w:b w:val="0"/>
+        </w:rPr>
+        <w:t>filterMatch</w:t>
+      </w:r>
+      <w:r>
+        <w:rPr>
+          <w:b w:val="0"/>
+        </w:rPr>
+        <w:t>: the header menu then shows Any / Customer / Partner / None radio</w:t>
+      </w:r>
+    </w:p>
+    <w:p>
+      <w:r>
+        <w:rPr>
+          <w:b w:val="0"/>
+        </w:rPr>
+        <w:t xml:space="preserve">  buttons (applied on click), stored as </w:t>
+      </w:r>
+      <w:r>
+        <w:rPr>
+          <w:rFonts w:ascii="Consolas" w:hAnsi="Consolas"/>
+          <w:b w:val="0"/>
+        </w:rPr>
+        <w:t>{ choice }</w:t>
+      </w:r>
+      <w:r>
+        <w:rPr>
+          <w:b w:val="0"/>
+        </w:rPr>
+        <w:t xml:space="preserve"> in the same </w:t>
+      </w:r>
+      <w:r>
+        <w:rPr>
+          <w:rFonts w:ascii="Consolas" w:hAnsi="Consolas"/>
+          <w:b w:val="0"/>
+        </w:rPr>
+        <w:t>columnFilters</w:t>
+      </w:r>
+      <w:r>
+        <w:rPr>
+          <w:b w:val="0"/>
+        </w:rPr>
+        <w:t xml:space="preserve">, with the usual chip, </w:t>
+      </w:r>
+      <w:r>
+        <w:rPr>
+          <w:rFonts w:ascii="Consolas" w:hAnsi="Consolas"/>
+          <w:b w:val="0"/>
+        </w:rPr>
+        <w:t>col-filtered</w:t>
+      </w:r>
+    </w:p>
+    <w:p>
+      <w:r>
+        <w:rPr>
+          <w:b w:val="0"/>
+        </w:rPr>
+        <w:t xml:space="preserve">  mark and Clear all (D5). The CSV table export gets the column.</w:t>
+      </w:r>
+    </w:p>
+    <w:p>
+      <w:pPr>
+        <w:pStyle w:val="ListBullet"/>
+      </w:pPr>
+      <w:r>
+        <w:rPr>
+          <w:b w:val="0"/>
+        </w:rPr>
+        <w:t xml:space="preserve">⋮ "Relationship…" after "Merge…" (no team, or the Team Admin): </w:t>
+      </w:r>
+      <w:r>
+        <w:rPr>
+          <w:rFonts w:ascii="Consolas" w:hAnsi="Consolas"/>
+          <w:b w:val="0"/>
+        </w:rPr>
+        <w:t>#relationship-dialog</w:t>
+      </w:r>
+      <w:r>
+        <w:rPr>
+          <w:b w:val="0"/>
+        </w:rPr>
+        <w:t xml:space="preserve"> with two checkboxes and an</w:t>
+      </w:r>
+    </w:p>
+    <w:p>
+      <w:r>
+        <w:rPr>
+          <w:b w:val="0"/>
+        </w:rPr>
+        <w:t xml:space="preserve">  explicit Save; </w:t>
+      </w:r>
+      <w:r>
+        <w:rPr>
+          <w:rFonts w:ascii="Consolas" w:hAnsi="Consolas"/>
+          <w:b w:val="0"/>
+        </w:rPr>
+        <w:t>setAccountRelationship</w:t>
+      </w:r>
+      <w:r>
+        <w:rPr>
+          <w:b w:val="0"/>
+        </w:rPr>
+        <w:t xml:space="preserve"> (storage.js) adds an entry (slug, name, domain, </w:t>
+      </w:r>
+      <w:r>
+        <w:rPr>
+          <w:rFonts w:ascii="Consolas" w:hAnsi="Consolas"/>
+          <w:b w:val="0"/>
+        </w:rPr>
+        <w:t>source: "account"</w:t>
+      </w:r>
+      <w:r>
+        <w:rPr>
+          <w:b w:val="0"/>
+        </w:rPr>
+        <w:t>) or</w:t>
+      </w:r>
+    </w:p>
+    <w:p>
+      <w:r>
+        <w:rPr>
+          <w:b w:val="0"/>
+        </w:rPr>
+        <w:t xml:space="preserve">  removes every entry of that category matching the account (also leftovers on the exclusion list); a pop-up only</w:t>
+      </w:r>
+    </w:p>
+    <w:p>
+      <w:r>
+        <w:rPr>
+          <w:b w:val="0"/>
+        </w:rPr>
+        <w:t xml:space="preserve">  when more than one entry was removed. Activity Log </w:t>
+      </w:r>
+      <w:r>
+        <w:rPr>
+          <w:rFonts w:ascii="Consolas" w:hAnsi="Consolas"/>
+          <w:b w:val="0"/>
+        </w:rPr>
+        <w:t>account_relationship_changed</w:t>
+      </w:r>
+      <w:r>
+        <w:rPr>
+          <w:b w:val="0"/>
+        </w:rPr>
+        <w:t>.</w:t>
+      </w:r>
+    </w:p>
+    <w:p>
+      <w:pPr>
+        <w:pStyle w:val="ListBullet"/>
+      </w:pPr>
+      <w:r>
+        <w:rPr>
+          <w:b w:val="0"/>
+        </w:rPr>
+        <w:t>Not checked in a browser stand-in (the old perf harness is gone): checked by Boaz in Chrome.</w:t>
       </w:r>
     </w:p>
     <w:p>

</xml_diff>

<commit_message>
1.2.3 step 2: live check passed (1.2.2.3)
Co-Authored-By: Claude Opus 5.5 <noreply@anthropic.com>
</commit_message>
<xml_diff>
--- a/EXCLUSIONS_RELATIONSHIPS_DESIGN.docx
+++ b/EXCLUSIONS_RELATIONSHIPS_DESIGN.docx
@@ -3146,9 +3146,23 @@
       </w:pPr>
       <w:r>
         <w:rPr>
-          <w:b w:val="0"/>
-        </w:rPr>
-        <w:t>Not checked in a browser stand-in (the old perf harness is gone): checked by Boaz in Chrome.</w:t>
+          <w:b/>
+        </w:rPr>
+        <w:t>Live check passed 2026-10-07</w:t>
+      </w:r>
+      <w:r>
+        <w:rPr>
+          <w:b w:val="0"/>
+        </w:rPr>
+        <w:t xml:space="preserve"> (Boaz, Chrome): column, tags (Customer, Customer · Partner), choice filter + chip,</w:t>
+      </w:r>
+    </w:p>
+    <w:p>
+      <w:r>
+        <w:rPr>
+          <w:b w:val="0"/>
+        </w:rPr>
+        <w:t xml:space="preserve">  ⋮ Relationship… on list row and account page, P3 -&gt; P2 and back.</w:t>
       </w:r>
     </w:p>
     <w:p>

</xml_diff>

<commit_message>
1.2.3 exclusions & relationships: step 3 - Setup tables, Customers and partners step, tick fix (1.2.2.4)
Co-Authored-By: Claude Opus 5.5 <noreply@anthropic.com>
</commit_message>
<xml_diff>
--- a/EXCLUSIONS_RELATIONSHIPS_DESIGN.docx
+++ b/EXCLUSIONS_RELATIONSHIPS_DESIGN.docx
@@ -3163,6 +3163,314 @@
           <w:b w:val="0"/>
         </w:rPr>
         <w:t xml:space="preserve">  ⋮ Relationship… on list row and account page, P3 -&gt; P2 and back.</w:t>
+      </w:r>
+    </w:p>
+    <w:p>
+      <w:pPr>
+        <w:pStyle w:val="Heading3"/>
+      </w:pPr>
+      <w:r>
+        <w:rPr>
+          <w:b w:val="0"/>
+        </w:rPr>
+        <w:t>2.10 Step 3 as built (1.2.2.4, 2026-10-07)</w:t>
+      </w:r>
+    </w:p>
+    <w:p>
+      <w:pPr>
+        <w:pStyle w:val="ListBullet"/>
+      </w:pPr>
+      <w:r>
+        <w:rPr>
+          <w:b w:val="0"/>
+        </w:rPr>
+        <w:t xml:space="preserve">New </w:t>
+      </w:r>
+      <w:r>
+        <w:rPr>
+          <w:rFonts w:ascii="Consolas" w:hAnsi="Consolas"/>
+          <w:b w:val="0"/>
+        </w:rPr>
+        <w:t>company-list-table.js</w:t>
+      </w:r>
+      <w:r>
+        <w:rPr>
+          <w:b w:val="0"/>
+        </w:rPr>
+        <w:t xml:space="preserve"> (DOM): one list as a table - Company, LinkedIn page, Website; A-Z; search; count;</w:t>
+      </w:r>
+    </w:p>
+    <w:p>
+      <w:r>
+        <w:rPr>
+          <w:b w:val="0"/>
+        </w:rPr>
+        <w:t xml:space="preserve">  + Add / Edit as an inline row (OK / Cancel, Enter / Escape) validated by the pure </w:t>
+      </w:r>
+      <w:r>
+        <w:rPr>
+          <w:rFonts w:ascii="Consolas" w:hAnsi="Consolas"/>
+          <w:b w:val="0"/>
+        </w:rPr>
+        <w:t>parseCompanyListEntry</w:t>
+      </w:r>
+    </w:p>
+    <w:p>
+      <w:r>
+        <w:rPr>
+          <w:b w:val="0"/>
+        </w:rPr>
+        <w:t xml:space="preserve">  (company-identity.js, with </w:t>
+      </w:r>
+      <w:r>
+        <w:rPr>
+          <w:rFonts w:ascii="Consolas" w:hAnsi="Consolas"/>
+          <w:b w:val="0"/>
+        </w:rPr>
+        <w:t>linkedinCompanySlug</w:t>
+      </w:r>
+      <w:r>
+        <w:rPr>
+          <w:b w:val="0"/>
+        </w:rPr>
+        <w:t xml:space="preserve"> and </w:t>
+      </w:r>
+      <w:r>
+        <w:rPr>
+          <w:rFonts w:ascii="Consolas" w:hAnsi="Consolas"/>
+          <w:b w:val="0"/>
+        </w:rPr>
+        <w:t>sameCompanyEntry</w:t>
+      </w:r>
+      <w:r>
+        <w:rPr>
+          <w:b w:val="0"/>
+        </w:rPr>
+        <w:t>); row ⋮ Edit, Remove, Move to (the other</w:t>
+      </w:r>
+    </w:p>
+    <w:p>
+      <w:r>
+        <w:rPr>
+          <w:b w:val="0"/>
+        </w:rPr>
+        <w:t xml:space="preserve">  four lists); a nameless entry shows its slug or domain greyed; "found by research" link; red flag row (D2).</w:t>
+      </w:r>
+    </w:p>
+    <w:p>
+      <w:pPr>
+        <w:pStyle w:val="ListBullet"/>
+      </w:pPr>
+      <w:r>
+        <w:rPr>
+          <w:b w:val="0"/>
+        </w:rPr>
+        <w:t>Setup: "Companies to exclude" = Competitors, Recruiters / staffing agencies, Other; new step **"Customers and</w:t>
+      </w:r>
+    </w:p>
+    <w:p>
+      <w:r>
+        <w:rPr>
+          <w:b w:val="0"/>
+        </w:rPr>
+        <w:t xml:space="preserve">  partners"** (</w:t>
+      </w:r>
+      <w:r>
+        <w:rPr>
+          <w:rFonts w:ascii="Consolas" w:hAnsi="Consolas"/>
+          <w:b w:val="0"/>
+        </w:rPr>
+        <w:t>relationships</w:t>
+      </w:r>
+      <w:r>
+        <w:rPr>
+          <w:b w:val="0"/>
+        </w:rPr>
+        <w:t>, right after it) = Customers, Partners / resellers. Both edit the one draft</w:t>
+      </w:r>
+    </w:p>
+    <w:p>
+      <w:r>
+        <w:rPr>
+          <w:b w:val="0"/>
+        </w:rPr>
+        <w:t xml:space="preserve">  </w:t>
+      </w:r>
+      <w:r>
+        <w:rPr>
+          <w:rFonts w:ascii="Consolas" w:hAnsi="Consolas"/>
+          <w:b w:val="0"/>
+        </w:rPr>
+        <w:t>companyExclusions</w:t>
+      </w:r>
+      <w:r>
+        <w:rPr>
+          <w:b w:val="0"/>
+        </w:rPr>
+        <w:t>; Save on either writes both lists (</w:t>
+      </w:r>
+      <w:r>
+        <w:rPr>
+          <w:rFonts w:ascii="Consolas" w:hAnsi="Consolas"/>
+          <w:b w:val="0"/>
+        </w:rPr>
+        <w:t>saveCompanyLists</w:t>
+      </w:r>
+      <w:r>
+        <w:rPr>
+          <w:b w:val="0"/>
+        </w:rPr>
+        <w:t>, D7). The five textareas and the line</w:t>
+      </w:r>
+    </w:p>
+    <w:p>
+      <w:r>
+        <w:rPr>
+          <w:b w:val="0"/>
+        </w:rPr>
+        <w:t xml:space="preserve">  parser are gone. Save is refused while a row is being edited.</w:t>
+      </w:r>
+    </w:p>
+    <w:p>
+      <w:pPr>
+        <w:pStyle w:val="ListBullet"/>
+      </w:pPr>
+      <w:r>
+        <w:rPr>
+          <w:b w:val="0"/>
+        </w:rPr>
+        <w:t xml:space="preserve">Proposals: setup-proposals.js now builds </w:t>
+      </w:r>
+      <w:r>
+        <w:rPr>
+          <w:rFonts w:ascii="Consolas" w:hAnsi="Consolas"/>
+          <w:b w:val="0"/>
+        </w:rPr>
+        <w:t>exclusions</w:t>
+      </w:r>
+      <w:r>
+        <w:rPr>
+          <w:b w:val="0"/>
+        </w:rPr>
+        <w:t xml:space="preserve"> (competitors) and </w:t>
+      </w:r>
+      <w:r>
+        <w:rPr>
+          <w:rFonts w:ascii="Consolas" w:hAnsi="Consolas"/>
+          <w:b w:val="0"/>
+        </w:rPr>
+        <w:t>relationships</w:t>
+      </w:r>
+      <w:r>
+        <w:rPr>
+          <w:b w:val="0"/>
+        </w:rPr>
+        <w:t xml:space="preserve"> (customers, partners) from</w:t>
+      </w:r>
+    </w:p>
+    <w:p>
+      <w:r>
+        <w:rPr>
+          <w:b w:val="0"/>
+        </w:rPr>
+        <w:t xml:space="preserve">  one pass (a company named twice is still proposed once); a research stored before 1.2.3 is split on the fly</w:t>
+      </w:r>
+    </w:p>
+    <w:p>
+      <w:r>
+        <w:rPr>
+          <w:b w:val="0"/>
+        </w:rPr>
+        <w:t xml:space="preserve">  (</w:t>
+      </w:r>
+      <w:r>
+        <w:rPr>
+          <w:rFonts w:ascii="Consolas" w:hAnsi="Consolas"/>
+          <w:b w:val="0"/>
+        </w:rPr>
+        <w:t>stepProposal</w:t>
+      </w:r>
+      <w:r>
+        <w:rPr>
+          <w:b w:val="0"/>
+        </w:rPr>
+        <w:t xml:space="preserve">). Ticks add / remove the company in its table; </w:t>
+      </w:r>
+      <w:r>
+        <w:rPr>
+          <w:b/>
+        </w:rPr>
+        <w:t>proposal-ui.js fix</w:t>
+      </w:r>
+      <w:r>
+        <w:rPr>
+          <w:b w:val="0"/>
+        </w:rPr>
+        <w:t xml:space="preserve">: a tick now calls </w:t>
+      </w:r>
+      <w:r>
+        <w:rPr>
+          <w:rFonts w:ascii="Consolas" w:hAnsi="Consolas"/>
+          <w:b w:val="0"/>
+        </w:rPr>
+        <w:t>onChange</w:t>
+      </w:r>
+      <w:r>
+        <w:rPr>
+          <w:b w:val="0"/>
+        </w:rPr>
+        <w:t>.</w:t>
+      </w:r>
+    </w:p>
+    <w:p>
+      <w:pPr>
+        <w:pStyle w:val="ListBullet"/>
+      </w:pPr>
+      <w:r>
+        <w:rPr>
+          <w:b w:val="0"/>
+        </w:rPr>
+        <w:t>Team member (R4.7): no + Add and no ⋮ (tables re-drawn once the read-only check has run).</w:t>
+      </w:r>
+    </w:p>
+    <w:p>
+      <w:pPr>
+        <w:pStyle w:val="ListBullet"/>
+      </w:pPr>
+      <w:r>
+        <w:rPr>
+          <w:b w:val="0"/>
+        </w:rPr>
+        <w:t xml:space="preserve">Checked in a new browser stand-in (scratchpad shim: fake </w:t>
+      </w:r>
+      <w:r>
+        <w:rPr>
+          <w:rFonts w:ascii="Consolas" w:hAnsi="Consolas"/>
+          <w:b w:val="0"/>
+        </w:rPr>
+        <w:t>chrome.*</w:t>
+      </w:r>
+      <w:r>
+        <w:rPr>
+          <w:b w:val="0"/>
+        </w:rPr>
+        <w:t xml:space="preserve"> seeded from the 2026-10-06 backup; launch.json</w:t>
+      </w:r>
+    </w:p>
+    <w:p>
+      <w:r>
+        <w:rPr>
+          <w:b w:val="0"/>
+        </w:rPr>
+        <w:t xml:space="preserve">  "st-shim"): load, Add with a bad LinkedIn link refused, Move to Customers + Save writes the right lists (IBM kept),</w:t>
+      </w:r>
+    </w:p>
+    <w:p>
+      <w:r>
+        <w:rPr>
+          <w:b w:val="0"/>
+        </w:rPr>
+        <w:t xml:space="preserve">  flag on both rows, Edit, search, member read-only, old research split and tick-to-table. 693 pure checks.</w:t>
       </w:r>
     </w:p>
     <w:p>
@@ -6665,7 +6973,7 @@
               <w:rPr>
                 <w:b w:val="0"/>
               </w:rPr>
-              <w:t>, the two steps, one draft, proposals into tables, tick-sync fix, team read-only</w:t>
+              <w:t>, the two steps, one draft, proposals into tables, tick-sync fix, team read-only (as built: 2.10)</w:t>
             </w:r>
           </w:p>
         </w:tc>

</xml_diff>

<commit_message>
1.2.3 step 3: live check passed (1.2.2.4)
Co-Authored-By: Claude Opus 5.5 <noreply@anthropic.com>
</commit_message>
<xml_diff>
--- a/EXCLUSIONS_RELATIONSHIPS_DESIGN.docx
+++ b/EXCLUSIONS_RELATIONSHIPS_DESIGN.docx
@@ -3471,6 +3471,31 @@
           <w:b w:val="0"/>
         </w:rPr>
         <w:t xml:space="preserve">  flag on both rows, Edit, search, member read-only, old research split and tick-to-table. 693 pure checks.</w:t>
+      </w:r>
+    </w:p>
+    <w:p>
+      <w:pPr>
+        <w:pStyle w:val="ListBullet"/>
+      </w:pPr>
+      <w:r>
+        <w:rPr>
+          <w:b/>
+        </w:rPr>
+        <w:t>Live check passed 2026-10-07</w:t>
+      </w:r>
+      <w:r>
+        <w:rPr>
+          <w:b w:val="0"/>
+        </w:rPr>
+        <w:t xml:space="preserve"> (Boaz, Chrome): tables, search, + Add, Move to Customers across the steps + Save,</w:t>
+      </w:r>
+    </w:p>
+    <w:p>
+      <w:r>
+        <w:rPr>
+          <w:b w:val="0"/>
+        </w:rPr>
+        <w:t xml:space="preserve">  Remove. Note from the test: "Move to" is a heading in the row menu, not an item - say so in test steps and Help.</w:t>
       </w:r>
     </w:p>
     <w:p>

</xml_diff>

<commit_message>
1.2.3 exclusions & relationships: step 4 - Help, PRD 6.24, release notes, research prompt V1.35, validator note (1.2.3)
Co-Authored-By: Claude Opus 5.5 <noreply@anthropic.com>
</commit_message>
<xml_diff>
--- a/EXCLUSIONS_RELATIONSHIPS_DESIGN.docx
+++ b/EXCLUSIONS_RELATIONSHIPS_DESIGN.docx
@@ -3496,6 +3496,125 @@
           <w:b w:val="0"/>
         </w:rPr>
         <w:t xml:space="preserve">  Remove. Note from the test: "Move to" is a heading in the row menu, not an item - say so in test steps and Help.</w:t>
+      </w:r>
+    </w:p>
+    <w:p>
+      <w:pPr>
+        <w:pStyle w:val="Heading3"/>
+      </w:pPr>
+      <w:r>
+        <w:rPr>
+          <w:b w:val="0"/>
+        </w:rPr>
+        <w:t>2.11 Step 4 as built (1.2.3, 2026-10-07)</w:t>
+      </w:r>
+    </w:p>
+    <w:p>
+      <w:pPr>
+        <w:pStyle w:val="ListBullet"/>
+      </w:pPr>
+      <w:r>
+        <w:rPr>
+          <w:b w:val="0"/>
+        </w:rPr>
+        <w:t>Help: new entries "How do I exclude a company?" (says "Move to" is a heading, not an item) and "How do I mark a company</w:t>
+      </w:r>
+    </w:p>
+    <w:p>
+      <w:r>
+        <w:rPr>
+          <w:b w:val="0"/>
+        </w:rPr>
+        <w:t xml:space="preserve">  as an existing customer or partner?"; the competitors entry and the Setup research entry name the new step.</w:t>
+      </w:r>
+    </w:p>
+    <w:p>
+      <w:r>
+        <w:rPr>
+          <w:b w:val="0"/>
+        </w:rPr>
+        <w:t xml:space="preserve">  onboarding.js </w:t>
+      </w:r>
+      <w:r>
+        <w:rPr>
+          <w:rFonts w:ascii="Consolas" w:hAnsi="Consolas"/>
+          <w:b w:val="0"/>
+        </w:rPr>
+        <w:t>RESEARCHED_STEPS_TEXT</w:t>
+      </w:r>
+      <w:r>
+        <w:rPr>
+          <w:b w:val="0"/>
+        </w:rPr>
+        <w:t xml:space="preserve"> names Customers and partners.</w:t>
+      </w:r>
+    </w:p>
+    <w:p>
+      <w:pPr>
+        <w:pStyle w:val="ListBullet"/>
+      </w:pPr>
+      <w:r>
+        <w:rPr>
+          <w:b w:val="0"/>
+        </w:rPr>
+        <w:t>PRD 6.24 (+ gen_docs.py mirror) and a note in the negative-topics section that the two filters are retired; release</w:t>
+      </w:r>
+    </w:p>
+    <w:p>
+      <w:r>
+        <w:rPr>
+          <w:b w:val="0"/>
+        </w:rPr>
+        <w:t xml:space="preserve">  notes v1.2.3.</w:t>
+      </w:r>
+    </w:p>
+    <w:p>
+      <w:pPr>
+        <w:pStyle w:val="ListBullet"/>
+      </w:pPr>
+      <w:r>
+        <w:rPr>
+          <w:b w:val="0"/>
+        </w:rPr>
+        <w:t>Research prompt V1.35 (ChatGPT Market Research; shipped as research-prompt.txt by gen_template.py): step 9 asks for</w:t>
+      </w:r>
+    </w:p>
+    <w:p>
+      <w:r>
+        <w:rPr>
+          <w:b w:val="0"/>
+        </w:rPr>
+        <w:t xml:space="preserve">  existing customers and partners, kept as accounts with Excluded = No. sheet_contract.py's Exclusion_Reason note says</w:t>
+      </w:r>
+    </w:p>
+    <w:p>
+      <w:r>
+        <w:rPr>
+          <w:b w:val="0"/>
+        </w:rPr>
+        <w:t xml:space="preserve">  so; validate_workbook.py prints a NOTE for Customer / Partner rows.</w:t>
+      </w:r>
+    </w:p>
+    <w:p>
+      <w:pPr>
+        <w:pStyle w:val="ListBullet"/>
+      </w:pPr>
+      <w:r>
+        <w:rPr>
+          <w:b w:val="0"/>
+        </w:rPr>
+        <w:t>Store listing and website: neither mentions customer / partner exclusion - no change.</w:t>
+      </w:r>
+    </w:p>
+    <w:p>
+      <w:pPr>
+        <w:pStyle w:val="ListBullet"/>
+      </w:pPr>
+      <w:r>
+        <w:rPr>
+          <w:b w:val="0"/>
+        </w:rPr>
+        <w:t>Checks: syntax clean, 693 pure checks, 125 team-sync checks; package builds/v1.2.3.</w:t>
       </w:r>
     </w:p>
     <w:p>

</xml_diff>